<commit_message>
Update DE startup CV template and remove obsolete instructions
</commit_message>
<xml_diff>
--- a/templates/cv_template_DE_startup.docx
+++ b/templates/cv_template_DE_startup.docx
@@ -265,8 +265,9 @@
           <w:bCs/>
           <w:sz w:val="21"/>
           <w:szCs w:val="21"/>
-        </w:rPr>
-        <w:t xml:space="preserve"> Advisor | </w:t>
+          <w:lang w:val="en-US"/>
+        </w:rPr>
+        <w:t xml:space="preserve"> &amp; Growth</w:t>
       </w:r>
       <w:r>
         <w:rPr>
@@ -274,9 +275,8 @@
           <w:bCs/>
           <w:sz w:val="21"/>
           <w:szCs w:val="21"/>
-          <w:lang w:val="en-US"/>
-        </w:rPr>
-        <w:t>Freelance</w:t>
+        </w:rPr>
+        <w:t xml:space="preserve"> Advisor | </w:t>
       </w:r>
       <w:r>
         <w:rPr>
@@ -284,8 +284,9 @@
           <w:bCs/>
           <w:sz w:val="21"/>
           <w:szCs w:val="21"/>
-        </w:rPr>
-        <w:t xml:space="preserve"> | Berli</w:t>
+          <w:lang w:val="en-US"/>
+        </w:rPr>
+        <w:t>Freelance</w:t>
       </w:r>
       <w:r>
         <w:rPr>
@@ -293,9 +294,8 @@
           <w:bCs/>
           <w:sz w:val="21"/>
           <w:szCs w:val="21"/>
-          <w:lang w:val="en-US"/>
-        </w:rPr>
-        <w:t>n</w:t>
+        </w:rPr>
+        <w:t xml:space="preserve"> | Berli</w:t>
       </w:r>
       <w:r>
         <w:rPr>
@@ -305,17 +305,7 @@
           <w:szCs w:val="21"/>
           <w:lang w:val="en-US"/>
         </w:rPr>
-        <w:tab/>
-      </w:r>
-      <w:r>
-        <w:rPr>
-          <w:b/>
-          <w:bCs/>
-          <w:sz w:val="21"/>
-          <w:szCs w:val="21"/>
-          <w:lang w:val="en-US"/>
-        </w:rPr>
-        <w:tab/>
+        <w:t>n</w:t>
       </w:r>
       <w:r>
         <w:rPr>

</xml_diff>

<commit_message>
Update templates and prompt structure
</commit_message>
<xml_diff>
--- a/templates/cv_template_DE_startup.docx
+++ b/templates/cv_template_DE_startup.docx
@@ -372,15 +372,16 @@
       <w:pPr>
         <w:spacing w:after="80"/>
         <w:rPr>
-          <w:lang w:val="en-US"/>
-        </w:rPr>
-      </w:pPr>
-      <w:r>
-        <w:rPr>
-          <w:rFonts w:ascii="Arial" w:eastAsia="Arial" w:hAnsi="Arial" w:cs="Arial"/>
-          <w:color w:val="444444"/>
-          <w:sz w:val="21"/>
-          <w:szCs w:val="21"/>
+          <w:sz w:val="21"/>
+          <w:szCs w:val="21"/>
+          <w:lang w:val="en-US"/>
+        </w:rPr>
+      </w:pPr>
+      <w:r>
+        <w:rPr>
+          <w:sz w:val="21"/>
+          <w:szCs w:val="21"/>
+          <w:lang w:val="en-US"/>
         </w:rPr>
         <w:t>Advising an early-stage social startup on digital marketing and acquisition, with a focus on conversion optimization and lifecycle marketing.</w:t>
       </w:r>
@@ -397,14 +398,14 @@
         <w:rPr>
           <w:sz w:val="21"/>
           <w:szCs w:val="21"/>
-        </w:rPr>
-      </w:pPr>
-      <w:r>
-        <w:rPr>
-          <w:rFonts w:ascii="Arial" w:eastAsia="Arial" w:hAnsi="Arial" w:cs="Arial"/>
-          <w:color w:val="444444"/>
-          <w:sz w:val="21"/>
-          <w:szCs w:val="21"/>
+          <w:lang w:val="en-US"/>
+        </w:rPr>
+      </w:pPr>
+      <w:r>
+        <w:rPr>
+          <w:sz w:val="21"/>
+          <w:szCs w:val="21"/>
+          <w:lang w:val="en-US"/>
         </w:rPr>
         <w:t>Built a complete email journey and email templates to replace manual WhatsApp communication, freeing 25 hours per week</w:t>
       </w:r>
@@ -421,14 +422,14 @@
         <w:rPr>
           <w:sz w:val="21"/>
           <w:szCs w:val="21"/>
-        </w:rPr>
-      </w:pPr>
-      <w:r>
-        <w:rPr>
-          <w:rFonts w:ascii="Arial" w:eastAsia="Arial" w:hAnsi="Arial" w:cs="Arial"/>
-          <w:color w:val="444444"/>
-          <w:sz w:val="21"/>
-          <w:szCs w:val="21"/>
+          <w:lang w:val="en-US"/>
+        </w:rPr>
+      </w:pPr>
+      <w:r>
+        <w:rPr>
+          <w:sz w:val="21"/>
+          <w:szCs w:val="21"/>
+          <w:lang w:val="en-US"/>
         </w:rPr>
         <w:t>Consolidated fragmented data into a unified system (HubSpot) to automate onboarding, engagement, and retention flows</w:t>
       </w:r>
@@ -439,7 +440,6 @@
         <w:rPr>
           <w:sz w:val="21"/>
           <w:szCs w:val="21"/>
-          <w:lang w:val="en-US"/>
         </w:rPr>
       </w:pPr>
       <w:r>
@@ -448,7 +448,6 @@
           <w:bCs/>
           <w:sz w:val="21"/>
           <w:szCs w:val="21"/>
-          <w:lang w:val="en-US"/>
         </w:rPr>
         <w:t>Client:</w:t>
       </w:r>
@@ -456,7 +455,6 @@
         <w:rPr>
           <w:sz w:val="21"/>
           <w:szCs w:val="21"/>
-          <w:lang w:val="en-US"/>
         </w:rPr>
         <w:t xml:space="preserve"> Zeya Social</w:t>
       </w:r>
@@ -516,6 +514,16 @@
           <w:bCs/>
           <w:sz w:val="21"/>
           <w:szCs w:val="21"/>
+        </w:rPr>
+        <w:tab/>
+      </w:r>
+      <w:r>
+        <w:rPr>
+          <w:b/>
+          <w:bCs/>
+          <w:sz w:val="21"/>
+          <w:szCs w:val="21"/>
+          <w:lang w:val="en-US"/>
         </w:rPr>
         <w:tab/>
       </w:r>
@@ -1400,6 +1408,7 @@
           <w:sz w:val="21"/>
           <w:szCs w:val="21"/>
         </w:rPr>
+        <w:lastRenderedPageBreak/>
         <w:t>MA in Linguistics | Shanghai International Studies University | China</w:t>
       </w:r>
     </w:p>

</xml_diff>